<commit_message>
v13: cut budget in half ($380k → $190k); add combined .md
Budget halved consistently across both docs:
- Total: $380k → $190k
- A0: $30k → $15k (A0a/A0b: $15k → $7.5k each)
- Track A: $150k → $75k (A1/A2/A4/A6: $15k/$30k/$45k/$60k → $7.5k/$15k/$22.5k/$30k)
- Track B: $200k → $100k (B1/B4/B6/B7a: $20k/$40k/$60k/$80k → $10k/$20k/$30k/$40k)
- A6 integrator-agreement withhold: $15k → $7.5k
- B7a/B7b mainnet withhold: $5k → $2.5k

Per-FTE rate updated: $9.7k/FTE/wk → $4.86k/FTE/wk. Budget transparency
note flags this assumes either (a) ecosystem-rate compensation below
senior-crypto market or (b) part-time per-FTE allocation. SDF retains
descope/restructure right at week 4 review (unchanged).

Also added: SDF_PROPOSAL_COMBINED.md (one-pager + appendix concatenated
with separator), parallel to the existing combined.docx. All three docx
regenerated against v13 markdown.

Co-Authored-By: Claude Opus 4.7 (1M context) <noreply@anthropic.com>
</commit_message>
<xml_diff>
--- a/SDF_PROPOSAL_COMBINED.docx
+++ b/SDF_PROPOSAL_COMBINED.docx
@@ -203,7 +203,7 @@
         <w:t xml:space="preserve"> </w:t>
       </w:r>
       <w:r>
-        <w:t xml:space="preserve">A user holds a BIP-39 seed offline at enrollment. From it we derive</w:t>
+        <w:t xml:space="preserve">At enrollment the user records a 24-word BIP-39 seed on paper, offline. The wallet deterministically derives</w:t>
       </w:r>
       <w:r>
         <w:t xml:space="preserve"> </w:t>
@@ -218,7 +218,16 @@
         <w:t xml:space="preserve"> </w:t>
       </w:r>
       <w:r>
-        <w:t xml:space="preserve">and store</w:t>
+        <w:t xml:space="preserve">and commits</w:t>
+      </w:r>
+      <w:r>
+        <w:t xml:space="preserve"> </w:t>
+      </w:r>
+      <w:r>
+        <w:rPr>
+          <w:b/>
+        </w:rPr>
+        <w:t xml:space="preserve">only its one-way hash</w:t>
       </w:r>
       <w:r>
         <w:t xml:space="preserve"> </w:t>
@@ -233,7 +242,49 @@
         <w:t xml:space="preserve"> </w:t>
       </w:r>
       <w:r>
-        <w:t xml:space="preserve">as a commitment. On recovery, the user generates a Noir/UltraHonk proof in the browser bound to a fully-specified</w:t>
+        <w:t xml:space="preserve">on-chain — the seed and</w:t>
+      </w:r>
+      <w:r>
+        <w:t xml:space="preserve"> </w:t>
+      </w:r>
+      <w:r>
+        <w:rPr>
+          <w:rStyle w:val="VerbatimChar"/>
+        </w:rPr>
+        <w:t xml:space="preserve">owner_secret</w:t>
+      </w:r>
+      <w:r>
+        <w:t xml:space="preserve"> </w:t>
+      </w:r>
+      <w:r>
+        <w:t xml:space="preserve">never leave the browser; on-chain observers see a meaningless 32-byte hash. On recovery, the user re-enters the seed, re-derives the same</w:t>
+      </w:r>
+      <w:r>
+        <w:t xml:space="preserve"> </w:t>
+      </w:r>
+      <w:r>
+        <w:rPr>
+          <w:rStyle w:val="VerbatimChar"/>
+        </w:rPr>
+        <w:t xml:space="preserve">owner_secret</w:t>
+      </w:r>
+      <w:r>
+        <w:t xml:space="preserve">, and generates a Noir/UltraHonk zero-knowledge proof of</w:t>
+      </w:r>
+      <w:r>
+        <w:t xml:space="preserve"> </w:t>
+      </w:r>
+      <w:r>
+        <w:rPr>
+          <w:i/>
+        </w:rPr>
+        <w:t xml:space="preserve">"I know the preimage of the on-chain commitment"</w:t>
+      </w:r>
+      <w:r>
+        <w:t xml:space="preserve"> </w:t>
+      </w:r>
+      <w:r>
+        <w:t xml:space="preserve">— proving identity without revealing the secret. The proof is bound to a fully-specified</w:t>
       </w:r>
       <w:r>
         <w:t xml:space="preserve"> </w:t>
@@ -248,7 +299,7 @@
         <w:t xml:space="preserve"> </w:t>
       </w:r>
       <w:r>
-        <w:t xml:space="preserve">(account, network, contract, new pubkey with on-curve + canonical-limb checks, nonce, timelock duration). A new</w:t>
+        <w:t xml:space="preserve">(account, network, contract, new pubkey with on-curve + canonical-limb checks, nonce, timelock duration), so it can't be replayed against a different rotation. A new</w:t>
       </w:r>
       <w:r>
         <w:t xml:space="preserve"> </w:t>
@@ -305,7 +356,7 @@
         <w:t xml:space="preserve">CallContract(self_addr)</w:t>
       </w:r>
       <w:r>
-        <w:t xml:space="preserve">) blocks any signer eviction during the window. Cancellation requires both the WebAuthn signer AND a fresh seed-knowledge proof, capped at 2 cancels per recovery (closes the cancel-loop attack). Integration plugs into g2c's existing OZ</w:t>
+        <w:t xml:space="preserve">) blocks any signer eviction during the 30-day window. Cancellation requires both the WebAuthn signer AND a fresh seed-knowledge proof, capped at 2 cancels per recovery (closes the cancel-loop attack). Integration plugs into g2c's existing OZ</w:t>
       </w:r>
       <w:r>
         <w:t xml:space="preserve"> </w:t>
@@ -708,7 +759,7 @@
               <w:t xml:space="preserve"> </w:t>
             </w:r>
             <w:r>
-              <w:t xml:space="preserve">Then A0a $15k (testnet</w:t>
+              <w:t xml:space="preserve">Then A0a $7.5k (testnet</w:t>
             </w:r>
             <w:r>
               <w:t xml:space="preserve"> </w:t>
@@ -723,29 +774,29 @@
               <w:t xml:space="preserve"> </w:t>
             </w:r>
             <w:r>
-              <w:t xml:space="preserve">numbers + Policy-with-cross-call benchmark + on-disk circuit aligned to spec) and A0b $15k (Groth16 comparison + browser benchmarks on iPhone 14 / Pixel 7 / 2020 MacBook Air)</w:t>
-            </w:r>
-          </w:p>
-        </w:tc>
-        <w:tc>
-          <w:p>
-            <w:pPr>
-              <w:pStyle w:val="Compact"/>
-              <w:jc w:val="left"/>
-            </w:pPr>
-            <w:r>
-              <w:t xml:space="preserve">$30k split 50/50</w:t>
-            </w:r>
-          </w:p>
-        </w:tc>
-        <w:tc>
-          <w:p>
-            <w:pPr>
-              <w:pStyle w:val="Compact"/>
-              <w:jc w:val="left"/>
-            </w:pPr>
-            <w:r>
-              <w:t xml:space="preserve">$30k</w:t>
+              <w:t xml:space="preserve">numbers + Policy-with-cross-call benchmark + on-disk circuit aligned to spec) and A0b $7.5k (Groth16 comparison + browser benchmarks on iPhone 14 / Pixel 7 / 2020 MacBook Air)</w:t>
+            </w:r>
+          </w:p>
+        </w:tc>
+        <w:tc>
+          <w:p>
+            <w:pPr>
+              <w:pStyle w:val="Compact"/>
+              <w:jc w:val="left"/>
+            </w:pPr>
+            <w:r>
+              <w:t xml:space="preserve">$15k split 50/50</w:t>
+            </w:r>
+          </w:p>
+        </w:tc>
+        <w:tc>
+          <w:p>
+            <w:pPr>
+              <w:pStyle w:val="Compact"/>
+              <w:jc w:val="left"/>
+            </w:pPr>
+            <w:r>
+              <w:t xml:space="preserve">$15k</w:t>
             </w:r>
           </w:p>
         </w:tc>
@@ -783,18 +834,18 @@
               <w:jc w:val="left"/>
             </w:pPr>
             <w:r>
-              <w:t xml:space="preserve">$150k tranched</w:t>
-            </w:r>
-          </w:p>
-        </w:tc>
-        <w:tc>
-          <w:p>
-            <w:pPr>
-              <w:pStyle w:val="Compact"/>
-              <w:jc w:val="left"/>
-            </w:pPr>
-            <w:r>
-              <w:t xml:space="preserve">$150k</w:t>
+              <w:t xml:space="preserve">$75k tranched</w:t>
+            </w:r>
+          </w:p>
+        </w:tc>
+        <w:tc>
+          <w:p>
+            <w:pPr>
+              <w:pStyle w:val="Compact"/>
+              <w:jc w:val="left"/>
+            </w:pPr>
+            <w:r>
+              <w:t xml:space="preserve">$75k</w:t>
             </w:r>
           </w:p>
         </w:tc>
@@ -832,18 +883,18 @@
               <w:jc w:val="left"/>
             </w:pPr>
             <w:r>
-              <w:t xml:space="preserve">$200k tranched</w:t>
-            </w:r>
-          </w:p>
-        </w:tc>
-        <w:tc>
-          <w:p>
-            <w:pPr>
-              <w:pStyle w:val="Compact"/>
-              <w:jc w:val="left"/>
-            </w:pPr>
-            <w:r>
-              <w:t xml:space="preserve">$200k</w:t>
+              <w:t xml:space="preserve">$100k tranched</w:t>
+            </w:r>
+          </w:p>
+        </w:tc>
+        <w:tc>
+          <w:p>
+            <w:pPr>
+              <w:pStyle w:val="Compact"/>
+              <w:jc w:val="left"/>
+            </w:pPr>
+            <w:r>
+              <w:t xml:space="preserve">$100k</w:t>
             </w:r>
           </w:p>
         </w:tc>
@@ -887,7 +938,7 @@
               <w:rPr>
                 <w:b/>
               </w:rPr>
-              <w:t xml:space="preserve">$380k</w:t>
+              <w:t xml:space="preserve">$190k</w:t>
             </w:r>
           </w:p>
         </w:tc>
@@ -1113,7 +1164,46 @@
         <w:t xml:space="preserve"> </w:t>
       </w:r>
       <w:r>
-        <w:t xml:space="preserve">A BIP-39 seed-derived</w:t>
+        <w:t xml:space="preserve">At enrollment the user records a BIP-39 seed offline. The wallet derives</w:t>
+      </w:r>
+      <w:r>
+        <w:t xml:space="preserve"> </w:t>
+      </w:r>
+      <w:r>
+        <w:rPr>
+          <w:rStyle w:val="VerbatimChar"/>
+        </w:rPr>
+        <w:t xml:space="preserve">owner_secret = HKDF(seed, account_id, network_passphrase)</w:t>
+      </w:r>
+      <w:r>
+        <w:t xml:space="preserve"> </w:t>
+      </w:r>
+      <w:r>
+        <w:t xml:space="preserve">and commits</w:t>
+      </w:r>
+      <w:r>
+        <w:t xml:space="preserve"> </w:t>
+      </w:r>
+      <w:r>
+        <w:rPr>
+          <w:b/>
+        </w:rPr>
+        <w:t xml:space="preserve">only the one-way hash</w:t>
+      </w:r>
+      <w:r>
+        <w:t xml:space="preserve"> </w:t>
+      </w:r>
+      <w:r>
+        <w:rPr>
+          <w:rStyle w:val="VerbatimChar"/>
+        </w:rPr>
+        <w:t xml:space="preserve">Poseidon2(owner_secret)</w:t>
+      </w:r>
+      <w:r>
+        <w:t xml:space="preserve"> </w:t>
+      </w:r>
+      <w:r>
+        <w:t xml:space="preserve">on-chain — neither seed nor secret leaves the browser. On recovery, the user re-derives</w:t>
       </w:r>
       <w:r>
         <w:t xml:space="preserve"> </w:t>
@@ -1128,19 +1218,7 @@
         <w:t xml:space="preserve"> </w:t>
       </w:r>
       <w:r>
-        <w:t xml:space="preserve">is committed on-chain at enrollment as</w:t>
-      </w:r>
-      <w:r>
-        <w:t xml:space="preserve"> </w:t>
-      </w:r>
-      <w:r>
-        <w:rPr>
-          <w:rStyle w:val="VerbatimChar"/>
-        </w:rPr>
-        <w:t xml:space="preserve">Poseidon2(owner_secret)</w:t>
-      </w:r>
-      <w:r>
-        <w:t xml:space="preserve">. On recovery, a Noir/UltraHonk proof bound to a fully-specified</w:t>
+        <w:t xml:space="preserve">from the seed and generates a Noir/UltraHonk proof of knowledge of the commitment's preimage (the proof reveals nothing about the secret), bound to a fully-specified</w:t>
       </w:r>
       <w:r>
         <w:t xml:space="preserve"> </w:t>
@@ -1155,7 +1233,7 @@
         <w:t xml:space="preserve"> </w:t>
       </w:r>
       <w:r>
-        <w:t xml:space="preserve">triggers a 30-day time-locked key rotation through a new</w:t>
+        <w:t xml:space="preserve">that fixes the new passkey. The proof triggers a 30-day time-locked key rotation through a new</w:t>
       </w:r>
       <w:r>
         <w:t xml:space="preserve"> </w:t>
@@ -5162,9 +5240,9 @@
       <w:pPr>
         <w:pStyle w:val="Heading3"/>
       </w:pPr>
-      <w:bookmarkStart w:id="45" w:name="X7e68ce51c8acfac471a318d012096d8dbd0d7fc"/>
-      <w:r>
-        <w:t xml:space="preserve">A0 — Pre-grant Soroban gas benchmark (weeks 1–2, $30k split 50/50)</w:t>
+      <w:bookmarkStart w:id="45" w:name="X7cb3cd5c855609eda68f91b44f02305dd8ea984"/>
+      <w:r>
+        <w:t xml:space="preserve">A0 — Pre-grant Soroban gas benchmark (weeks 1–2, $15k split 50/50)</w:t>
       </w:r>
       <w:bookmarkEnd w:id="45"/>
     </w:p>
@@ -5194,7 +5272,7 @@
         <w:t xml:space="preserve">reimbursement after delivery</w:t>
       </w:r>
       <w:r>
-        <w:t xml:space="preserve">, not advance funding. The team carries A0 work at risk; SDF disburses A0a's $15k on A0a deliverables verified, A0b's $15k on A0b deliverables verified. If A0 fails the pass criterion, the $30k is not paid; no clawback because no advance was made.</w:t>
+        <w:t xml:space="preserve">, not advance funding. The team carries A0 work at risk; SDF disburses A0a's $7.5k on A0a deliverables verified, A0b's $7.5k on A0b deliverables verified. If A0 fails the pass criterion, the $15k is not paid; no clawback because no advance was made.</w:t>
       </w:r>
     </w:p>
     <w:p>
@@ -5290,7 +5368,7 @@
               <w:jc w:val="left"/>
             </w:pPr>
             <w:r>
-              <w:t xml:space="preserve">$15k</w:t>
+              <w:t xml:space="preserve">$7.5k</w:t>
             </w:r>
           </w:p>
         </w:tc>
@@ -5382,7 +5460,7 @@
               <w:jc w:val="left"/>
             </w:pPr>
             <w:r>
-              <w:t xml:space="preserve">$15k</w:t>
+              <w:t xml:space="preserve">$7.5k</w:t>
             </w:r>
           </w:p>
         </w:tc>
@@ -5611,9 +5689,9 @@
       <w:pPr>
         <w:pStyle w:val="Heading3"/>
       </w:pPr>
-      <w:bookmarkStart w:id="46" w:name="X26909ea21238596e65b968c57310a80633bf1ec"/>
-      <w:r>
-        <w:t xml:space="preserve">Track A — g2c ZK recovery ($150k tranched 10/20/30/40)</w:t>
+      <w:bookmarkStart w:id="46" w:name="X7cd88177393aee8ebf63108a2023ba41b8e62b3"/>
+      <w:r>
+        <w:t xml:space="preserve">Track A — g2c ZK recovery ($75k tranched 10/20/30/40)</w:t>
       </w:r>
       <w:bookmarkEnd w:id="46"/>
     </w:p>
@@ -5752,7 +5830,7 @@
         <w:rPr>
           <w:i/>
         </w:rPr>
-        <w:t xml:space="preserve">(10% — $15k)</w:t>
+        <w:t xml:space="preserve">(10% — $7.5k)</w:t>
       </w:r>
       <w:r>
         <w:t xml:space="preserve"> </w:t>
@@ -6024,7 +6102,7 @@
         <w:rPr>
           <w:i/>
         </w:rPr>
-        <w:t xml:space="preserve">(20% — $30k)</w:t>
+        <w:t xml:space="preserve">(20% — $15k)</w:t>
       </w:r>
       <w:r>
         <w:t xml:space="preserve"> </w:t>
@@ -6291,7 +6369,7 @@
         <w:rPr>
           <w:i/>
         </w:rPr>
-        <w:t xml:space="preserve">(30% — $45k)</w:t>
+        <w:t xml:space="preserve">(30% — $22.5k)</w:t>
       </w:r>
       <w:r>
         <w:t xml:space="preserve"> </w:t>
@@ -6387,7 +6465,7 @@
         <w:rPr>
           <w:i/>
         </w:rPr>
-        <w:t xml:space="preserve">(40% — $60k, with $15k withhold if integrator agreement not signed)</w:t>
+        <w:t xml:space="preserve">(40% — $30k, with $7.5k withhold if integrator agreement not signed)</w:t>
       </w:r>
       <w:r>
         <w:t xml:space="preserve"> </w:t>
@@ -6420,16 +6498,16 @@
         <w:t xml:space="preserve"> </w:t>
       </w:r>
       <w:r>
-        <w:t xml:space="preserve">if signed agreement is not secured by week 12, A6 ships with (a) integrator's-guide published + (b) public integration RFP open + (c) ≥1 LOI in hand; SDF holds back $15k of the $60k tranche pending signed agreement within 60 days post-grant, releasing the withhold on signature. |</w:t>
+        <w:t xml:space="preserve">if signed agreement is not secured by week 12, A6 ships with (a) integrator's-guide published + (b) public integration RFP open + (c) ≥1 LOI in hand; SDF holds back $7.5k of the $30k tranche pending signed agreement within 60 days post-grant, releasing the withhold on signature. |</w:t>
       </w:r>
     </w:p>
     <w:p>
       <w:pPr>
         <w:pStyle w:val="Heading3"/>
       </w:pPr>
-      <w:bookmarkStart w:id="47" w:name="X36c27cb2d6b944d212eb4df10001f918419efac"/>
-      <w:r>
-        <w:t xml:space="preserve">Track B — neftwerk ZK privacy ($200k tranched 10/20/30/40)</w:t>
+      <w:bookmarkStart w:id="47" w:name="Xadd119a66632d999513aa23ae39e7f0680c18a9"/>
+      <w:r>
+        <w:t xml:space="preserve">Track B — neftwerk ZK privacy ($100k tranched 10/20/30/40)</w:t>
       </w:r>
       <w:bookmarkEnd w:id="47"/>
     </w:p>
@@ -6616,7 +6694,7 @@
               <w:rPr>
                 <w:i/>
               </w:rPr>
-              <w:t xml:space="preserve">(10% — $20k)</w:t>
+              <w:t xml:space="preserve">(10% — $10k)</w:t>
             </w:r>
           </w:p>
         </w:tc>
@@ -6823,7 +6901,7 @@
               <w:rPr>
                 <w:i/>
               </w:rPr>
-              <w:t xml:space="preserve">(20% — $40k)</w:t>
+              <w:t xml:space="preserve">(20% — $20k)</w:t>
             </w:r>
           </w:p>
         </w:tc>
@@ -6954,7 +7032,7 @@
               <w:rPr>
                 <w:i/>
               </w:rPr>
-              <w:t xml:space="preserve">(30% — $60k)</w:t>
+              <w:t xml:space="preserve">(30% — $30k)</w:t>
             </w:r>
           </w:p>
         </w:tc>
@@ -7021,7 +7099,7 @@
               <w:rPr>
                 <w:i/>
               </w:rPr>
-              <w:t xml:space="preserve">(40% — $80k less $5k withhold if mainnet)</w:t>
+              <w:t xml:space="preserve">(40% — $40k less $2.5k withhold if mainnet)</w:t>
             </w:r>
           </w:p>
         </w:tc>
@@ -7106,7 +7184,7 @@
               <w:rPr>
                 <w:i/>
               </w:rPr>
-              <w:t xml:space="preserve">(post-grant — $0 delta or released $5k withhold)</w:t>
+              <w:t xml:space="preserve">(post-grant — $0 delta or released $2.5k withhold)</w:t>
             </w:r>
           </w:p>
         </w:tc>
@@ -7151,7 +7229,7 @@
               <w:t xml:space="preserve">after grant close</w:t>
             </w:r>
             <w:r>
-              <w:t xml:space="preserve">: telemetry already running, report generation only. SDF releases the $5k withhold from B7a on receipt of B7b (only applicable if mainnet pilot launched at B7a).</w:t>
+              <w:t xml:space="preserve">: telemetry already running, report generation only. SDF releases the $2.5k withhold from B7a on receipt of B7b (only applicable if mainnet pilot launched at B7a).</w:t>
             </w:r>
           </w:p>
         </w:tc>
@@ -7228,7 +7306,7 @@
         <w:rPr>
           <w:b/>
         </w:rPr>
-        <w:t xml:space="preserve">Total: $380k over 14 weeks.</w:t>
+        <w:t xml:space="preserve">Total: $190k over 14 weeks.</w:t>
       </w:r>
     </w:p>
     <w:tbl>
@@ -7313,18 +7391,18 @@
               <w:jc w:val="left"/>
             </w:pPr>
             <w:r>
-              <w:t xml:space="preserve">$30k</w:t>
-            </w:r>
-          </w:p>
-        </w:tc>
-        <w:tc>
-          <w:p>
-            <w:pPr>
-              <w:pStyle w:val="Compact"/>
-              <w:jc w:val="left"/>
-            </w:pPr>
-            <w:r>
-              <w:t xml:space="preserve">A0a $15k / A0b $15k on completion of each half</w:t>
+              <w:t xml:space="preserve">$15k</w:t>
+            </w:r>
+          </w:p>
+        </w:tc>
+        <w:tc>
+          <w:p>
+            <w:pPr>
+              <w:pStyle w:val="Compact"/>
+              <w:jc w:val="left"/>
+            </w:pPr>
+            <w:r>
+              <w:t xml:space="preserve">A0a $7.5k / A0b $7.5k on completion of each half</w:t>
             </w:r>
           </w:p>
         </w:tc>
@@ -7348,7 +7426,7 @@
               <w:jc w:val="left"/>
             </w:pPr>
             <w:r>
-              <w:t xml:space="preserve">$150k</w:t>
+              <w:t xml:space="preserve">$75k</w:t>
             </w:r>
           </w:p>
         </w:tc>
@@ -7383,7 +7461,7 @@
               <w:jc w:val="left"/>
             </w:pPr>
             <w:r>
-              <w:t xml:space="preserve">$200k</w:t>
+              <w:t xml:space="preserve">$100k</w:t>
             </w:r>
           </w:p>
         </w:tc>
@@ -7409,7 +7487,7 @@
               <w:t xml:space="preserve"> </w:t>
             </w:r>
             <w:r>
-              <w:t xml:space="preserve">(B7b is post-grant, $0 delta with $5k withhold from B7a if mainnet launched), gated on A0 pass + Pillar 2 compliance gates; B1 held until C1 in SDF reviewer's hands</w:t>
+              <w:t xml:space="preserve">(B7b is post-grant, $0 delta with $2.5k withhold from B7a if mainnet launched), gated on A0 pass + Pillar 2 compliance gates; B1 held until C1 in SDF reviewer's hands</w:t>
             </w:r>
           </w:p>
         </w:tc>
@@ -7439,7 +7517,7 @@
               <w:rPr>
                 <w:b/>
               </w:rPr>
-              <w:t xml:space="preserve">$380k</w:t>
+              <w:t xml:space="preserve">$190k</w:t>
             </w:r>
           </w:p>
         </w:tc>
@@ -8030,7 +8108,7 @@
         <w:t xml:space="preserve"> </w:t>
       </w:r>
       <w:r>
-        <w:t xml:space="preserve">$380k = $30k (A0, partial allocation across 3 FTE for 2 weeks) + $350k for the 12-week Track A + Track B build (≈ $9.7k/FTE/week × 3 FTE × 12 weeks). The 14-week envelope includes A0; A0's $30k is sized as partial-allocation pre-grant work, not a full 3-FTE × 2-week sprint. All figures are</w:t>
+        <w:t xml:space="preserve">$190k = $15k (A0, partial allocation across 3 FTE for 2 weeks) + $175k for the 12-week Track A + Track B build (≈ $4.86k/FTE/week × 3 FTE × 12 weeks). The 14-week envelope includes A0; A0's $15k is sized as partial-allocation pre-grant work, not a full 3-FTE × 2-week sprint. All figures are</w:t>
       </w:r>
       <w:r>
         <w:t xml:space="preserve"> </w:t>
@@ -8045,7 +8123,7 @@
         <w:t xml:space="preserve"> </w:t>
       </w:r>
       <w:r>
-        <w:t xml:space="preserve">(fully loaded comp, taxes, benefits, overhead); team commitments are documented at grant signing. SDF retains the right to descope or restructure if the loading chart proves untenable at week 4 review.</w:t>
+        <w:t xml:space="preserve">(fully loaded comp, taxes, benefits, overhead). At ~$4.86k/FTE/week the budget assumes either (a) the team is taking ecosystem-rate compensation below senior-crypto market, treating the grant as partial cost-recovery for work they'd do anyway, or (b) part-time allocation per FTE. Team commitments are documented at grant signing. SDF retains the right to descope or restructure if the loading chart proves untenable at week 4 review.</w:t>
       </w:r>
     </w:p>
     <w:p>

</xml_diff>